<commit_message>
Resume drafts: citizenship in the header, a tighter freelance block
Co-Authored-By: Claude Opus 5.5 <noreply@anthropic.com>
Claude-Session: https://claude.ai/code/session_011ij1jHUQhdVNAxy6tqXpvT
</commit_message>
<xml_diff>
--- a/docs/resume/drafts/resume-delivery-ops.docx
+++ b/docs/resume/drafts/resume-delivery-ops.docx
@@ -29,7 +29,7 @@
           <w:i w:val="0"/>
           <w:sz w:val="20"/>
         </w:rPr>
-        <w:t>Toronto, ON | 613-795-9684 | hello@sidhantmathur.com</w:t>
+        <w:t>Toronto, ON | Canadian citizen | 613-795-9684 | hello@sidhantmathur.com</w:t>
       </w:r>
     </w:p>
     <w:p>
@@ -480,22 +480,6 @@
     </w:p>
     <w:p>
       <w:pPr>
-        <w:pStyle w:val="ListBullet"/>
-        <w:spacing w:before="0" w:after="20" w:line="240" w:lineRule="auto"/>
-        <w:ind w:left="317" w:hanging="202"/>
-      </w:pPr>
-      <w:r>
-        <w:rPr>
-          <w:rFonts w:ascii="Calibri" w:hAnsi="Calibri" w:cs="Calibri" w:eastAsia="Calibri"/>
-          <w:b w:val="0"/>
-          <w:i w:val="0"/>
-          <w:sz w:val="20"/>
-        </w:rPr>
-        <w:t>Resolved a client security breach and restored their domains from email blacklists.</w:t>
-      </w:r>
-    </w:p>
-    <w:p>
-      <w:pPr>
         <w:tabs>
           <w:tab w:pos="10800" w:val="right"/>
         </w:tabs>
@@ -744,20 +728,6 @@
           <w:sz w:val="20"/>
         </w:rPr>
         <w:t>Claude Code, Anthropic API, LLM integration &amp; agentic workflows, prompt engineering</w:t>
-      </w:r>
-    </w:p>
-    <w:p>
-      <w:pPr>
-        <w:spacing w:before="40" w:after="0" w:line="240" w:lineRule="auto"/>
-      </w:pPr>
-      <w:r>
-        <w:rPr>
-          <w:rFonts w:ascii="Calibri" w:hAnsi="Calibri" w:cs="Calibri" w:eastAsia="Calibri"/>
-          <w:b/>
-          <w:i w:val="0"/>
-          <w:sz w:val="20"/>
-        </w:rPr>
-        <w:t>Canadian citizen</w:t>
       </w:r>
     </w:p>
     <w:sectPr>

</xml_diff>